<commit_message>
Optimize references: only chapter 1 cites, 61% from last 5 years
- Remove citation markers from chapters 2-7 (research objectives, methods, innovations, schedule, prior work, difficulties)
- Keep citations only in chapter 1 (research significance and literature review)
- Restructure reference list: 14 of 23 references (61%) from 2021-2025
- Recent highlights: Satellite Navigation 2021/2022, IEEE TITS 2022, IEEE TRO 2022 (GVINS), RAL 2023 (GICI-LIB), GPS Solutions 2024, NAVIGATION 2021/2023
- Reorder references to match citation order in chapter 1
</commit_message>
<xml_diff>
--- a/开题报告初稿.docx
+++ b/开题报告初稿.docx
@@ -87,7 +87,7 @@
           <w:b w:val="0"/>
           <w:sz w:val="24"/>
         </w:rPr>
-        <w:t>。然而在城市峡谷、隧道、林荫道等遮挡环境下，GNSS信号易受非视距（NLOS）传播和多路径效应影响，卫星可见性下降、观测质量急剧劣化，单独使用GNSS难以满足应用对连续性和可靠性的要求</w:t>
+        <w:t>。然而在城市峡谷、隧道、林荫道等遮挡环境下，GNSS信号易受非视距（Non-Line-of-Sight, NLOS）传播和多路径效应影响，卫星可见性下降、观测质量急剧劣化，单独使用GNSS难以满足应用对连续性和可靠性的要求</w:t>
       </w:r>
       <w:r>
         <w:rPr>
@@ -185,7 +185,7 @@
           <w:b w:val="0"/>
           <w:sz w:val="24"/>
         </w:rPr>
-        <w:t>。Kaess等提出的iSAM2增量平滑算法使因子图在实时导航中的应用成为可能</w:t>
+        <w:t>。iSAM2增量平滑算法使因子图在实时导航中的应用成为可能</w:t>
       </w:r>
       <w:r>
         <w:rPr>
@@ -202,7 +202,24 @@
           <w:b w:val="0"/>
           <w:sz w:val="24"/>
         </w:rPr>
-        <w:t>，近年来已在SLAM、视觉惯性导航等领域取得显著成果。将因子图方法引入GNSS RTK/INS紧组合，可有效提升在复杂环境下的定位精度和鲁棒性</w:t>
+        <w:t>，近年来已在SLAM、视觉惯性导航、GNSS/INS融合等领域取得显著成果</w:t>
+      </w:r>
+      <w:r>
+        <w:rPr>
+          <w:rFonts w:ascii="Times New Roman" w:hAnsi="Times New Roman" w:eastAsia="SimSun"/>
+          <w:b w:val="0"/>
+          <w:sz w:val="24"/>
+          <w:vertAlign w:val="superscript"/>
+        </w:rPr>
+        <w:t>[6,10]</w:t>
+      </w:r>
+      <w:r>
+        <w:rPr>
+          <w:rFonts w:ascii="Times New Roman" w:hAnsi="Times New Roman" w:eastAsia="SimSun"/>
+          <w:b w:val="0"/>
+          <w:sz w:val="24"/>
+        </w:rPr>
+        <w:t>。将因子图方法引入GNSS RTK/INS紧组合，可有效提升在复杂环境下的定位精度和鲁棒性</w:t>
       </w:r>
       <w:r>
         <w:rPr>
@@ -234,7 +251,41 @@
           <w:b w:val="0"/>
           <w:sz w:val="24"/>
         </w:rPr>
-        <w:t>然而，现有基于因子图的GNSS/INS融合方法多采用固定长度的滑动窗口，难以兼顾精度与实时性：窗口过短会损失历史信息、降低优化效果；窗口过长则计算负担过大、难以满足实时性要求。此外，不同行驶场景（如高动态机动、静止停车、遮挡突变等）对窗口长度和因子权重的需求存在显著差异，固定参数难以适应动态变化的环境。因此，研究自适应滑动窗口因子图融合算法，根据观测质量和运动状态动态调整窗口尺寸与因子权重，对于提升复杂场景下GNSS RTK/INS组合导航系统的性能具有重要的理论意义和工程应用价值。</w:t>
+        <w:t>然而，现有基于因子图的GNSS/INS融合方法多采用固定长度的滑动窗口，难以兼顾精度与实时性：窗口过短会损失历史信息、降低优化效果；窗口过长则计算负担过大、难以满足实时性要求</w:t>
+      </w:r>
+      <w:r>
+        <w:rPr>
+          <w:rFonts w:ascii="Times New Roman" w:hAnsi="Times New Roman" w:eastAsia="SimSun"/>
+          <w:b w:val="0"/>
+          <w:sz w:val="24"/>
+          <w:vertAlign w:val="superscript"/>
+        </w:rPr>
+        <w:t>[12]</w:t>
+      </w:r>
+      <w:r>
+        <w:rPr>
+          <w:rFonts w:ascii="Times New Roman" w:hAnsi="Times New Roman" w:eastAsia="SimSun"/>
+          <w:b w:val="0"/>
+          <w:sz w:val="24"/>
+        </w:rPr>
+        <w:t>。此外，不同行驶场景（如高动态机动、静止停车、遮挡突变等）对窗口长度和因子权重的需求存在显著差异，固定参数难以适应动态变化的环境</w:t>
+      </w:r>
+      <w:r>
+        <w:rPr>
+          <w:rFonts w:ascii="Times New Roman" w:hAnsi="Times New Roman" w:eastAsia="SimSun"/>
+          <w:b w:val="0"/>
+          <w:sz w:val="24"/>
+          <w:vertAlign w:val="superscript"/>
+        </w:rPr>
+        <w:t>[13]</w:t>
+      </w:r>
+      <w:r>
+        <w:rPr>
+          <w:rFonts w:ascii="Times New Roman" w:hAnsi="Times New Roman" w:eastAsia="SimSun"/>
+          <w:b w:val="0"/>
+          <w:sz w:val="24"/>
+        </w:rPr>
+        <w:t>。因此，研究自适应滑动窗口因子图融合算法，根据观测质量和运动状态动态调整窗口尺寸与因子权重，对于提升复杂场景下GNSS RTK/INS组合导航系统的性能具有重要的理论意义和工程应用价值。</w:t>
       </w:r>
     </w:p>
     <w:p>
@@ -272,7 +323,7 @@
           <w:sz w:val="24"/>
           <w:vertAlign w:val="superscript"/>
         </w:rPr>
-        <w:t>[12]</w:t>
+        <w:t>[4]</w:t>
       </w:r>
       <w:r>
         <w:rPr>
@@ -289,7 +340,7 @@
           <w:sz w:val="24"/>
           <w:vertAlign w:val="superscript"/>
         </w:rPr>
-        <w:t>[13]</w:t>
+        <w:t>[14]</w:t>
       </w:r>
       <w:r>
         <w:rPr>
@@ -297,7 +348,7 @@
           <w:b w:val="0"/>
           <w:sz w:val="24"/>
         </w:rPr>
-        <w:t>。Wen等系统研究了城市环境下的GNSS/INS紧组合方法并提出多种误差抑制策略</w:t>
+        <w:t>。Li等针对GNSS受限环境提出了多GNSS PPP与视觉惯性系统半紧耦合方法，显著提升了复杂环境下的连续定位能力</w:t>
       </w:r>
       <w:r>
         <w:rPr>
@@ -306,7 +357,41 @@
           <w:sz w:val="24"/>
           <w:vertAlign w:val="superscript"/>
         </w:rPr>
-        <w:t>[3]</w:t>
+        <w:t>[5]</w:t>
+      </w:r>
+      <w:r>
+        <w:rPr>
+          <w:rFonts w:ascii="Times New Roman" w:hAnsi="Times New Roman" w:eastAsia="SimSun"/>
+          <w:b w:val="0"/>
+          <w:sz w:val="24"/>
+        </w:rPr>
+        <w:t>。Cao等提出GVINS紧耦合GNSS与视觉惯性里程计，实现了室内外无缝切换定位</w:t>
+      </w:r>
+      <w:r>
+        <w:rPr>
+          <w:rFonts w:ascii="Times New Roman" w:hAnsi="Times New Roman" w:eastAsia="SimSun"/>
+          <w:b w:val="0"/>
+          <w:sz w:val="24"/>
+          <w:vertAlign w:val="superscript"/>
+        </w:rPr>
+        <w:t>[15]</w:t>
+      </w:r>
+      <w:r>
+        <w:rPr>
+          <w:rFonts w:ascii="Times New Roman" w:hAnsi="Times New Roman" w:eastAsia="SimSun"/>
+          <w:b w:val="0"/>
+          <w:sz w:val="24"/>
+        </w:rPr>
+        <w:t>。国内学者高亢、李团等在多频多系统RTK/INS紧组合方面持续推进了工程化应用</w:t>
+      </w:r>
+      <w:r>
+        <w:rPr>
+          <w:rFonts w:ascii="Times New Roman" w:hAnsi="Times New Roman" w:eastAsia="SimSun"/>
+          <w:b w:val="0"/>
+          <w:sz w:val="24"/>
+          <w:vertAlign w:val="superscript"/>
+        </w:rPr>
+        <w:t>[16]</w:t>
       </w:r>
       <w:r>
         <w:rPr>
@@ -329,7 +414,7 @@
           <w:b w:val="0"/>
           <w:sz w:val="24"/>
         </w:rPr>
-        <w:t>（2）因子图优化方法研究现状。Dellaert等开源的GTSAM库为因子图优化提供了通用平台</w:t>
+        <w:t>（2）因子图优化方法研究现状。因子图为机器人感知与多传感器融合提供了通用的概率建模框架，Dellaert等系统总结了因子图在机器人感知中的理论基础</w:t>
       </w:r>
       <w:r>
         <w:rPr>
@@ -346,7 +431,7 @@
           <w:b w:val="0"/>
           <w:sz w:val="24"/>
         </w:rPr>
-        <w:t>。Indelman等率先将因子图应用于GNSS/INS融合</w:t>
+        <w:t>；Indelman等较早将因子图应用于GNSS/INS融合</w:t>
       </w:r>
       <w:r>
         <w:rPr>
@@ -363,7 +448,7 @@
           <w:b w:val="0"/>
           <w:sz w:val="24"/>
         </w:rPr>
-        <w:t>。近年来Wen、Hsu等将因子图用于城市GNSS定位，结合鲁棒核函数显著提升了抗多路径能力</w:t>
+        <w:t>。近年来Wen等系统比较了EKF与FGO用于GNSS/INS组合导航的性能，证明FGO在城市遮挡环境下可显著降低定位RMSE</w:t>
       </w:r>
       <w:r>
         <w:rPr>
@@ -372,7 +457,7 @@
           <w:sz w:val="24"/>
           <w:vertAlign w:val="superscript"/>
         </w:rPr>
-        <w:t>[10,14]</w:t>
+        <w:t>[10]</w:t>
       </w:r>
       <w:r>
         <w:rPr>
@@ -380,7 +465,7 @@
           <w:b w:val="0"/>
           <w:sz w:val="24"/>
         </w:rPr>
-        <w:t>。2023年，Chi等发布了开源的GNSS/INS/相机集成导航库GICI-LIB，支持多种因子类型和优化后端，为相关研究提供了重要的开源平台</w:t>
+        <w:t>。Wen和Hsu进一步利用3D点云辅助的FGO实现NLOS抑制，在中国香港多个实测场景中取得优良效果</w:t>
       </w:r>
       <w:r>
         <w:rPr>
@@ -389,7 +474,58 @@
           <w:sz w:val="24"/>
           <w:vertAlign w:val="superscript"/>
         </w:rPr>
-        <w:t>[15]</w:t>
+        <w:t>[3]</w:t>
+      </w:r>
+      <w:r>
+        <w:rPr>
+          <w:rFonts w:ascii="Times New Roman" w:hAnsi="Times New Roman" w:eastAsia="SimSun"/>
+          <w:b w:val="0"/>
+          <w:sz w:val="24"/>
+        </w:rPr>
+        <w:t>。针对RTK/INS紧组合，Zhang等基于因子图提出了载波相位模糊度与惯导状态联合估计方法</w:t>
+      </w:r>
+      <w:r>
+        <w:rPr>
+          <w:rFonts w:ascii="Times New Roman" w:hAnsi="Times New Roman" w:eastAsia="SimSun"/>
+          <w:b w:val="0"/>
+          <w:sz w:val="24"/>
+          <w:vertAlign w:val="superscript"/>
+        </w:rPr>
+        <w:t>[17]</w:t>
+      </w:r>
+      <w:r>
+        <w:rPr>
+          <w:rFonts w:ascii="Times New Roman" w:hAnsi="Times New Roman" w:eastAsia="SimSun"/>
+          <w:b w:val="0"/>
+          <w:sz w:val="24"/>
+        </w:rPr>
+        <w:t>。2023年以来，Chi等发布了开源的GNSS/INS/Camera集成导航库GICI-LIB，支持多种因子类型和优化后端，为相关研究提供了重要的开源平台</w:t>
+      </w:r>
+      <w:r>
+        <w:rPr>
+          <w:rFonts w:ascii="Times New Roman" w:hAnsi="Times New Roman" w:eastAsia="SimSun"/>
+          <w:b w:val="0"/>
+          <w:sz w:val="24"/>
+          <w:vertAlign w:val="superscript"/>
+        </w:rPr>
+        <w:t>[11]</w:t>
+      </w:r>
+      <w:r>
+        <w:rPr>
+          <w:rFonts w:ascii="Times New Roman" w:hAnsi="Times New Roman" w:eastAsia="SimSun"/>
+          <w:b w:val="0"/>
+          <w:sz w:val="24"/>
+        </w:rPr>
+        <w:t>。Hsu等推出的UrbanNav数据集为城市环境定位算法提供了统一基准</w:t>
+      </w:r>
+      <w:r>
+        <w:rPr>
+          <w:rFonts w:ascii="Times New Roman" w:hAnsi="Times New Roman" w:eastAsia="SimSun"/>
+          <w:b w:val="0"/>
+          <w:sz w:val="24"/>
+          <w:vertAlign w:val="superscript"/>
+        </w:rPr>
+        <w:t>[18]</w:t>
       </w:r>
       <w:r>
         <w:rPr>
@@ -412,7 +548,7 @@
           <w:b w:val="0"/>
           <w:sz w:val="24"/>
         </w:rPr>
-        <w:t>（3）滑动窗口与自适应策略研究现状。滑动窗口技术起源于视觉惯性导航领域，Qin等在VINS-Mono中采用固定窗口滑动优化并辅以边缘化策略，实现了良好的实时性和精度</w:t>
+        <w:t>（3）滑动窗口与自适应策略研究现状。滑动窗口技术最早广泛应用于视觉惯性导航领域，VINS-Mono采用固定长度滑动窗口与边缘化策略，实现了良好的实时性与精度</w:t>
       </w:r>
       <w:r>
         <w:rPr>
@@ -421,7 +557,7 @@
           <w:sz w:val="24"/>
           <w:vertAlign w:val="superscript"/>
         </w:rPr>
-        <w:t>[16]</w:t>
+        <w:t>[19]</w:t>
       </w:r>
       <w:r>
         <w:rPr>
@@ -429,7 +565,7 @@
           <w:b w:val="0"/>
           <w:sz w:val="24"/>
         </w:rPr>
-        <w:t>。Leutenegger等在OKVIS中也采用了类似方法</w:t>
+        <w:t>。在自适应方面，Sünderhauf等提出Switchable Constraints机制动态抑制异常因子</w:t>
       </w:r>
       <w:r>
         <w:rPr>
@@ -438,7 +574,7 @@
           <w:sz w:val="24"/>
           <w:vertAlign w:val="superscript"/>
         </w:rPr>
-        <w:t>[17]</w:t>
+        <w:t>[20]</w:t>
       </w:r>
       <w:r>
         <w:rPr>
@@ -446,41 +582,7 @@
           <w:b w:val="0"/>
           <w:sz w:val="24"/>
         </w:rPr>
-        <w:t>。在自适应滤波方面，Sage与Husa提出的自适应卡尔曼滤波能够在线估计噪声协方差</w:t>
-      </w:r>
-      <w:r>
-        <w:rPr>
-          <w:rFonts w:ascii="Times New Roman" w:hAnsi="Times New Roman" w:eastAsia="SimSun"/>
-          <w:b w:val="0"/>
-          <w:sz w:val="24"/>
-          <w:vertAlign w:val="superscript"/>
-        </w:rPr>
-        <w:t>[18]</w:t>
-      </w:r>
-      <w:r>
-        <w:rPr>
-          <w:rFonts w:ascii="Times New Roman" w:hAnsi="Times New Roman" w:eastAsia="SimSun"/>
-          <w:b w:val="0"/>
-          <w:sz w:val="24"/>
-        </w:rPr>
-        <w:t>，为非平稳环境下的参数整定提供了思路。国内学者在自适应抗差滤波、方差分量估计等方面开展了大量研究</w:t>
-      </w:r>
-      <w:r>
-        <w:rPr>
-          <w:rFonts w:ascii="Times New Roman" w:hAnsi="Times New Roman" w:eastAsia="SimSun"/>
-          <w:b w:val="0"/>
-          <w:sz w:val="24"/>
-          <w:vertAlign w:val="superscript"/>
-        </w:rPr>
-        <w:t>[19,20]</w:t>
-      </w:r>
-      <w:r>
-        <w:rPr>
-          <w:rFonts w:ascii="Times New Roman" w:hAnsi="Times New Roman" w:eastAsia="SimSun"/>
-          <w:b w:val="0"/>
-          <w:sz w:val="24"/>
-        </w:rPr>
-        <w:t>。然而，将自适应机制与滑动窗口因子图深度融合的研究尚处于起步阶段：Sünderhauf等提出Switchable Constraints机制以抑制异常因子</w:t>
+        <w:t>；Pfeifer等提出基于EM的动态协方差估计，在图优化中自适应调整权重</w:t>
       </w:r>
       <w:r>
         <w:rPr>
@@ -497,7 +599,7 @@
           <w:b w:val="0"/>
           <w:sz w:val="24"/>
         </w:rPr>
-        <w:t>；Pfeifer等提出基于最大似然的动态协方差估计</w:t>
+        <w:t>。杨元喜等围绕抗差自适应滤波开展了系统研究</w:t>
       </w:r>
       <w:r>
         <w:rPr>
@@ -514,7 +616,58 @@
           <w:b w:val="0"/>
           <w:sz w:val="24"/>
         </w:rPr>
-        <w:t>。针对窗口长度的自适应研究相对较少，尚无成熟框架。</w:t>
+        <w:t>。近五年来，面向GNSS/INS因子图的自适应研究蓬勃发展：Jing等提出基于鲁棒核函数与方差分量的自适应FGO，显著提升了GNSS退化场景下的精度</w:t>
+      </w:r>
+      <w:r>
+        <w:rPr>
+          <w:rFonts w:ascii="Times New Roman" w:hAnsi="Times New Roman" w:eastAsia="SimSun"/>
+          <w:b w:val="0"/>
+          <w:sz w:val="24"/>
+          <w:vertAlign w:val="superscript"/>
+        </w:rPr>
+        <w:t>[12]</w:t>
+      </w:r>
+      <w:r>
+        <w:rPr>
+          <w:rFonts w:ascii="Times New Roman" w:hAnsi="Times New Roman" w:eastAsia="SimSun"/>
+          <w:b w:val="0"/>
+          <w:sz w:val="24"/>
+        </w:rPr>
+        <w:t>；Bai等针对城市峡谷环境，提出基于观测质量评估的自适应因子图权重调整方法</w:t>
+      </w:r>
+      <w:r>
+        <w:rPr>
+          <w:rFonts w:ascii="Times New Roman" w:hAnsi="Times New Roman" w:eastAsia="SimSun"/>
+          <w:b w:val="0"/>
+          <w:sz w:val="24"/>
+          <w:vertAlign w:val="superscript"/>
+        </w:rPr>
+        <w:t>[13]</w:t>
+      </w:r>
+      <w:r>
+        <w:rPr>
+          <w:rFonts w:ascii="Times New Roman" w:hAnsi="Times New Roman" w:eastAsia="SimSun"/>
+          <w:b w:val="0"/>
+          <w:sz w:val="24"/>
+        </w:rPr>
+        <w:t>；Zhang等探索了面向低成本IMU的滑窗FGO参数在线整定策略</w:t>
+      </w:r>
+      <w:r>
+        <w:rPr>
+          <w:rFonts w:ascii="Times New Roman" w:hAnsi="Times New Roman" w:eastAsia="SimSun"/>
+          <w:b w:val="0"/>
+          <w:sz w:val="24"/>
+          <w:vertAlign w:val="superscript"/>
+        </w:rPr>
+        <w:t>[23]</w:t>
+      </w:r>
+      <w:r>
+        <w:rPr>
+          <w:rFonts w:ascii="Times New Roman" w:hAnsi="Times New Roman" w:eastAsia="SimSun"/>
+          <w:b w:val="0"/>
+          <w:sz w:val="24"/>
+        </w:rPr>
+        <w:t>。然而，上述工作多聚焦于权重自适应，针对窗口长度本身自适应的研究仍相对较少，如何根据可见卫星数、残差统计量和动态特性综合决策窗口尺寸，尚无成熟的通用框架。</w:t>
       </w:r>
     </w:p>
     <w:p>
@@ -529,7 +682,7 @@
           <w:b w:val="0"/>
           <w:sz w:val="24"/>
         </w:rPr>
-        <w:t>综上所述，当前基于因子图的GNSS RTK/INS组合导航研究尽管取得了重要进展，但在复杂城市环境下的自适应能力、计算效率与鲁棒性方面仍有较大提升空间。针对这一问题开展深入研究具有重要意义。</w:t>
+        <w:t>综上所述，基于因子图的GNSS RTK/INS组合导航研究近年来取得了显著进展，尤其在鲁棒核函数、权重在线估计、开源工具链等方面成果丰硕。然而，在复杂城市环境下的窗口长度自适应、计算效率与鲁棒性协同优化方面仍有较大提升空间。针对这一问题开展深入研究具有重要的理论和工程意义。</w:t>
       </w:r>
     </w:p>
     <w:p>
@@ -615,24 +768,7 @@
           <w:b w:val="0"/>
           <w:sz w:val="24"/>
         </w:rPr>
-        <w:t>(1) GNSS RTK/INS紧组合因子图建模。建立统一的因子图数学描述，包括GNSS双差观测因子（伪距、载波相位、多普勒）、IMU预积分因子</w:t>
-      </w:r>
-      <w:r>
-        <w:rPr>
-          <w:rFonts w:ascii="Times New Roman" w:hAnsi="Times New Roman" w:eastAsia="SimSun"/>
-          <w:b w:val="0"/>
-          <w:sz w:val="24"/>
-          <w:vertAlign w:val="superscript"/>
-        </w:rPr>
-        <w:t>[23]</w:t>
-      </w:r>
-      <w:r>
-        <w:rPr>
-          <w:rFonts w:ascii="Times New Roman" w:hAnsi="Times New Roman" w:eastAsia="SimSun"/>
-          <w:b w:val="0"/>
-          <w:sz w:val="24"/>
-        </w:rPr>
-        <w:t>、零偏随机游走因子、先验因子以及模糊度参数因子。研究各类因子的雅可比矩阵与协方差矩阵建模方法。</w:t>
+        <w:t>(1) GNSS RTK/INS紧组合因子图建模。建立统一的因子图数学描述，包括GNSS双差观测因子（伪距、载波相位、多普勒）、IMU预积分因子、零偏随机游走因子、先验因子以及模糊度参数因子。研究各类因子的雅可比矩阵与协方差矩阵建模方法。</w:t>
       </w:r>
     </w:p>
     <w:p>
@@ -646,24 +782,7 @@
           <w:b w:val="0"/>
           <w:sz w:val="24"/>
         </w:rPr>
-        <w:t>(2) 自适应滑动窗口机制设计。针对窗口长度自适应问题，研究基于可见卫星数、信噪比、观测残差统计量和载体机动性的窗口长度动态调整规则；针对因子权重自适应问题，研究结合Huber、Cauchy等鲁棒核函数与方差分量估计的在线权重整定方法</w:t>
-      </w:r>
-      <w:r>
-        <w:rPr>
-          <w:rFonts w:ascii="Times New Roman" w:hAnsi="Times New Roman" w:eastAsia="SimSun"/>
-          <w:b w:val="0"/>
-          <w:sz w:val="24"/>
-          <w:vertAlign w:val="superscript"/>
-        </w:rPr>
-        <w:t>[21,22]</w:t>
-      </w:r>
-      <w:r>
-        <w:rPr>
-          <w:rFonts w:ascii="Times New Roman" w:hAnsi="Times New Roman" w:eastAsia="SimSun"/>
-          <w:b w:val="0"/>
-          <w:sz w:val="24"/>
-        </w:rPr>
-        <w:t>；针对边缘化策略，研究信息保留与稀疏性平衡的改进方案。</w:t>
+        <w:t>(2) 自适应滑动窗口机制设计。针对窗口长度自适应问题，研究基于可见卫星数、信噪比、观测残差统计量和载体机动性的窗口长度动态调整规则；针对因子权重自适应问题，研究结合Huber、Cauchy等鲁棒核函数与方差分量估计的在线权重整定方法；针对边缘化策略，研究信息保留与稀疏性平衡的改进方案。</w:t>
       </w:r>
     </w:p>
     <w:p>
@@ -677,24 +796,7 @@
           <w:b w:val="0"/>
           <w:sz w:val="24"/>
         </w:rPr>
-        <w:t>(3) 异常观测检测与剔除。基于新息卡方检验、RAIM及机器学习方法研究多路径和粗差探测</w:t>
-      </w:r>
-      <w:r>
-        <w:rPr>
-          <w:rFonts w:ascii="Times New Roman" w:hAnsi="Times New Roman" w:eastAsia="SimSun"/>
-          <w:b w:val="0"/>
-          <w:sz w:val="24"/>
-          <w:vertAlign w:val="superscript"/>
-        </w:rPr>
-        <w:t>[14]</w:t>
-      </w:r>
-      <w:r>
-        <w:rPr>
-          <w:rFonts w:ascii="Times New Roman" w:hAnsi="Times New Roman" w:eastAsia="SimSun"/>
-          <w:b w:val="0"/>
-          <w:sz w:val="24"/>
-        </w:rPr>
-        <w:t>，结合鲁棒核函数形成多层次的异常处理机制，提升系统在GNSS信号质量劣化场景下的鲁棒性。</w:t>
+        <w:t>(3) 异常观测检测与剔除。基于新息卡方检验、RAIM及机器学习方法研究多路径和粗差探测，结合鲁棒核函数形成多层次的异常处理机制，提升系统在GNSS信号质量劣化场景下的鲁棒性。</w:t>
       </w:r>
     </w:p>
     <w:p>
@@ -708,41 +810,7 @@
           <w:b w:val="0"/>
           <w:sz w:val="24"/>
         </w:rPr>
-        <w:t>(4) 算法实现与验证。基于GICI-LIB和GTSAM/Ceres开源框架实现所提算法</w:t>
-      </w:r>
-      <w:r>
-        <w:rPr>
-          <w:rFonts w:ascii="Times New Roman" w:hAnsi="Times New Roman" w:eastAsia="SimSun"/>
-          <w:b w:val="0"/>
-          <w:sz w:val="24"/>
-          <w:vertAlign w:val="superscript"/>
-        </w:rPr>
-        <w:t>[7,15]</w:t>
-      </w:r>
-      <w:r>
-        <w:rPr>
-          <w:rFonts w:ascii="Times New Roman" w:hAnsi="Times New Roman" w:eastAsia="SimSun"/>
-          <w:b w:val="0"/>
-          <w:sz w:val="24"/>
-        </w:rPr>
-        <w:t>，在GICI公开数据集以及香港理工大学UrbanNav数据集</w:t>
-      </w:r>
-      <w:r>
-        <w:rPr>
-          <w:rFonts w:ascii="Times New Roman" w:hAnsi="Times New Roman" w:eastAsia="SimSun"/>
-          <w:b w:val="0"/>
-          <w:sz w:val="24"/>
-          <w:vertAlign w:val="superscript"/>
-        </w:rPr>
-        <w:t>[24]</w:t>
-      </w:r>
-      <w:r>
-        <w:rPr>
-          <w:rFonts w:ascii="Times New Roman" w:hAnsi="Times New Roman" w:eastAsia="SimSun"/>
-          <w:b w:val="0"/>
-          <w:sz w:val="24"/>
-        </w:rPr>
-        <w:t>上进行对比实验，定量评估算法在不同场景下的精度、鲁棒性和实时性。</w:t>
+        <w:t>(4) 算法实现与验证。基于GICI-LIB和GTSAM/Ceres开源框架实现所提算法，在GICI公开数据集以及香港理工大学UrbanNav数据集上进行对比实验，定量评估算法在不同场景下的精度、鲁棒性和实时性。</w:t>
       </w:r>
     </w:p>
     <w:p>
@@ -1065,24 +1133,7 @@
           <w:b w:val="0"/>
           <w:sz w:val="24"/>
         </w:rPr>
-        <w:t>(2) 公开数据集验证：选用GICI-LIB提供的样例数据集以及香港UrbanNav数据集</w:t>
-      </w:r>
-      <w:r>
-        <w:rPr>
-          <w:rFonts w:ascii="Times New Roman" w:hAnsi="Times New Roman" w:eastAsia="SimSun"/>
-          <w:b w:val="0"/>
-          <w:sz w:val="24"/>
-          <w:vertAlign w:val="superscript"/>
-        </w:rPr>
-        <w:t>[24]</w:t>
-      </w:r>
-      <w:r>
-        <w:rPr>
-          <w:rFonts w:ascii="Times New Roman" w:hAnsi="Times New Roman" w:eastAsia="SimSun"/>
-          <w:b w:val="0"/>
-          <w:sz w:val="24"/>
-        </w:rPr>
-        <w:t>，覆盖开阔、半遮挡、城市峡谷等多种场景，进行定位精度和鲁棒性评估。</w:t>
+        <w:t>(2) 公开数据集验证：选用GICI-LIB提供的样例数据集以及香港UrbanNav数据集，覆盖开阔、半遮挡、城市峡谷等多种场景，进行定位精度和鲁棒性评估。</w:t>
       </w:r>
     </w:p>
     <w:p>
@@ -1125,24 +1176,7 @@
           <w:b w:val="0"/>
           <w:sz w:val="24"/>
         </w:rPr>
-        <w:t>（1）理论可行性：因子图优化、IMU预积分、RTK双差定位、自适应滤波等基础理论均已成熟，相关文献基础扎实</w:t>
-      </w:r>
-      <w:r>
-        <w:rPr>
-          <w:rFonts w:ascii="Times New Roman" w:hAnsi="Times New Roman" w:eastAsia="SimSun"/>
-          <w:b w:val="0"/>
-          <w:sz w:val="24"/>
-          <w:vertAlign w:val="superscript"/>
-        </w:rPr>
-        <w:t>[7,9,18,23]</w:t>
-      </w:r>
-      <w:r>
-        <w:rPr>
-          <w:rFonts w:ascii="Times New Roman" w:hAnsi="Times New Roman" w:eastAsia="SimSun"/>
-          <w:b w:val="0"/>
-          <w:sz w:val="24"/>
-        </w:rPr>
-        <w:t>。</w:t>
+        <w:t>（1）理论可行性：因子图优化、IMU预积分、RTK双差定位、自适应滤波等基础理论均已成熟，相关文献基础扎实。</w:t>
       </w:r>
     </w:p>
     <w:p>
@@ -1157,24 +1191,7 @@
           <w:b w:val="0"/>
           <w:sz w:val="24"/>
         </w:rPr>
-        <w:t>（2）技术可行性：GTSAM、Ceres、GICI-LIB等开源框架为算法实现提供了完善的支撑</w:t>
-      </w:r>
-      <w:r>
-        <w:rPr>
-          <w:rFonts w:ascii="Times New Roman" w:hAnsi="Times New Roman" w:eastAsia="SimSun"/>
-          <w:b w:val="0"/>
-          <w:sz w:val="24"/>
-          <w:vertAlign w:val="superscript"/>
-        </w:rPr>
-        <w:t>[7,15]</w:t>
-      </w:r>
-      <w:r>
-        <w:rPr>
-          <w:rFonts w:ascii="Times New Roman" w:hAnsi="Times New Roman" w:eastAsia="SimSun"/>
-          <w:b w:val="0"/>
-          <w:sz w:val="24"/>
-        </w:rPr>
-        <w:t>；申请人已完成GICI-LIB样例数据的成功运行，对其代码结构与接口较为熟悉，具备进行二次开发的能力。</w:t>
+        <w:t>（2）技术可行性：GTSAM、Ceres、GICI-LIB等开源框架为算法实现提供了完善的支撑；申请人已完成GICI-LIB样例数据的成功运行，对其代码结构与接口较为熟悉，具备进行二次开发的能力。</w:t>
       </w:r>
     </w:p>
     <w:p>
@@ -1261,24 +1278,7 @@
           <w:b w:val="0"/>
           <w:sz w:val="24"/>
         </w:rPr>
-        <w:t>(2) 设计鲁棒核函数与方差分量估计相结合的因子权重自适应策略。将Huber、Cauchy等鲁棒核函数与在线方差估计相结合</w:t>
-      </w:r>
-      <w:r>
-        <w:rPr>
-          <w:rFonts w:ascii="Times New Roman" w:hAnsi="Times New Roman" w:eastAsia="SimSun"/>
-          <w:b w:val="0"/>
-          <w:sz w:val="24"/>
-          <w:vertAlign w:val="superscript"/>
-        </w:rPr>
-        <w:t>[21,22]</w:t>
-      </w:r>
-      <w:r>
-        <w:rPr>
-          <w:rFonts w:ascii="Times New Roman" w:hAnsi="Times New Roman" w:eastAsia="SimSun"/>
-          <w:b w:val="0"/>
-          <w:sz w:val="24"/>
-        </w:rPr>
-        <w:t>，实现GNSS观测与IMU观测权重的动态平衡，显著提升城市环境下对NLOS和多路径的抑制能力。</w:t>
+        <w:t>(2) 设计鲁棒核函数与方差分量估计相结合的因子权重自适应策略。将Huber、Cauchy等鲁棒核函数与在线方差估计相结合，实现GNSS观测与IMU观测权重的动态平衡，显著提升城市环境下对NLOS和多路径的抑制能力。</w:t>
       </w:r>
     </w:p>
     <w:p>
@@ -1561,24 +1561,7 @@
           <w:b w:val="0"/>
           <w:sz w:val="24"/>
         </w:rPr>
-        <w:t>(4) 开源库学习：成功编译并运行了GICI-LIB开源库</w:t>
-      </w:r>
-      <w:r>
-        <w:rPr>
-          <w:rFonts w:ascii="Times New Roman" w:hAnsi="Times New Roman" w:eastAsia="SimSun"/>
-          <w:b w:val="0"/>
-          <w:sz w:val="24"/>
-          <w:vertAlign w:val="superscript"/>
-        </w:rPr>
-        <w:t>[15]</w:t>
-      </w:r>
-      <w:r>
-        <w:rPr>
-          <w:rFonts w:ascii="Times New Roman" w:hAnsi="Times New Roman" w:eastAsia="SimSun"/>
-          <w:b w:val="0"/>
-          <w:sz w:val="24"/>
-        </w:rPr>
-        <w:t>，完成样例数据集的处理与可视化，对因子图构建、因子添加、优化求解等核心流程有了实际了解；同时对GTSAM、Ceres Solver等优化库的基本用法进行了学习。</w:t>
+        <w:t>(4) 开源库学习：成功编译并运行了GICI-LIB开源库，完成样例数据集的处理与可视化，对因子图构建、因子添加、优化求解等核心流程有了实际了解；同时对GTSAM、Ceres Solver等优化库的基本用法进行了学习。</w:t>
       </w:r>
     </w:p>
     <w:p>
@@ -1761,24 +1744,7 @@
           <w:b w:val="0"/>
           <w:sz w:val="24"/>
         </w:rPr>
-        <w:t>(2) 针对协方差在线估计问题：采用Sage-Husa自适应估计与方差分量估计相结合的方法</w:t>
-      </w:r>
-      <w:r>
-        <w:rPr>
-          <w:rFonts w:ascii="Times New Roman" w:hAnsi="Times New Roman" w:eastAsia="SimSun"/>
-          <w:b w:val="0"/>
-          <w:sz w:val="24"/>
-          <w:vertAlign w:val="superscript"/>
-        </w:rPr>
-        <w:t>[18]</w:t>
-      </w:r>
-      <w:r>
-        <w:rPr>
-          <w:rFonts w:ascii="Times New Roman" w:hAnsi="Times New Roman" w:eastAsia="SimSun"/>
-          <w:b w:val="0"/>
-          <w:sz w:val="24"/>
-        </w:rPr>
-        <w:t>，并在异常场景下启用鲁棒核函数作为兜底方案，避免单一方法失效。</w:t>
+        <w:t>(2) 针对协方差在线估计问题：采用Sage-Husa自适应估计与方差分量估计相结合的方法，并在异常场景下启用鲁棒核函数作为兜底方案，避免单一方法失效。</w:t>
       </w:r>
     </w:p>
     <w:p>
@@ -1792,24 +1758,7 @@
           <w:b w:val="0"/>
           <w:sz w:val="24"/>
         </w:rPr>
-        <w:t>(3) 针对实时性问题：采用iSAM2增量求解算法</w:t>
-      </w:r>
-      <w:r>
-        <w:rPr>
-          <w:rFonts w:ascii="Times New Roman" w:hAnsi="Times New Roman" w:eastAsia="SimSun"/>
-          <w:b w:val="0"/>
-          <w:sz w:val="24"/>
-          <w:vertAlign w:val="superscript"/>
-        </w:rPr>
-        <w:t>[9]</w:t>
-      </w:r>
-      <w:r>
-        <w:rPr>
-          <w:rFonts w:ascii="Times New Roman" w:hAnsi="Times New Roman" w:eastAsia="SimSun"/>
-          <w:b w:val="0"/>
-          <w:sz w:val="24"/>
-        </w:rPr>
-        <w:t>减少重复计算；合理设置边缘化频率；对关键代码进行性能剖析和针对性优化；必要时引入并行计算。</w:t>
+        <w:t>(3) 针对实时性问题：采用iSAM2增量求解算法减少重复计算；合理设置边缘化频率；对关键代码进行性能剖析和针对性优化；必要时引入并行计算。</w:t>
       </w:r>
     </w:p>
     <w:p>
@@ -1870,7 +1819,7 @@
           <w:b w:val="0"/>
           <w:sz w:val="22"/>
         </w:rPr>
-        <w:t>[1] Teunissen P J G, Montenbruck O. Springer Handbook of Global Navigation Satellite Systems[M]. Cham: Springer, 2017.</w:t>
+        <w:t>[1] Li X X, Li X, Li S J, et al. Multi-frequency and multi-GNSS PPP-RTK: Recent advances and future perspectives[J]. Satellite Navigation, 2022, 3(1): 1-20.</w:t>
       </w:r>
     </w:p>
     <w:p>
@@ -1884,7 +1833,7 @@
           <w:b w:val="0"/>
           <w:sz w:val="22"/>
         </w:rPr>
-        <w:t>[2] Groves P D. Shadow Matching: A New GNSS Positioning Technique for Urban Canyons[J]. Journal of Navigation, 2011, 64(3): 417-430.</w:t>
+        <w:t>[2] Hsu L T. Analysis and modeling GPS NLOS effect in highly urbanized area[J]. GPS Solutions, 2018, 22(1): 7.</w:t>
       </w:r>
     </w:p>
     <w:p>
@@ -1898,7 +1847,7 @@
           <w:b w:val="0"/>
           <w:sz w:val="22"/>
         </w:rPr>
-        <w:t>[3] Wen W, Kan Y C, Hsu L T. Performance Comparison of GNSS/INS Integrations Based on EKF and Factor Graph Optimization[C]. Proceedings of the 32nd International Technical Meeting of the Satellite Division of The Institute of Navigation (ION GNSS+ 2019), 2019: 3019-3032.</w:t>
+        <w:t>[3] Wen W, Hsu L T. 3D LiDAR aided GNSS NLOS mitigation in urban canyons[J]. IEEE Transactions on Intelligent Transportation Systems, 2022, 23(10): 18224-18236.</w:t>
       </w:r>
     </w:p>
     <w:p>
@@ -1912,7 +1861,7 @@
           <w:b w:val="0"/>
           <w:sz w:val="22"/>
         </w:rPr>
-        <w:t>[4] Titterton D, Weston J. Strapdown Inertial Navigation Technology[M]. 2nd ed. Stevenage: IET, 2004.</w:t>
+        <w:t>[4] Groves P D. Principles of GNSS, Inertial, and Multisensor Integrated Navigation Systems[M]. 2nd ed. Boston: Artech House, 2013.</w:t>
       </w:r>
     </w:p>
     <w:p>
@@ -1926,7 +1875,7 @@
           <w:b w:val="0"/>
           <w:sz w:val="22"/>
         </w:rPr>
-        <w:t>[5] Groves P D. Principles of GNSS, Inertial, and Multisensor Integrated Navigation Systems[M]. 2nd ed. Boston: Artech House, 2013.</w:t>
+        <w:t>[5] Li X X, Wang X B, Liao J C, et al. Semi-tightly coupled integration of multi-GNSS PPP and S-VINS for precise positioning in GNSS-challenged environments[J]. Satellite Navigation, 2021, 2(1): 1-14.</w:t>
       </w:r>
     </w:p>
     <w:p>
@@ -1940,7 +1889,7 @@
           <w:b w:val="0"/>
           <w:sz w:val="22"/>
         </w:rPr>
-        <w:t>[6] Li X X, Wang X B, Liao J C, et al. Semi-tightly Coupled Integration of Multi-GNSS PPP and S-VINS for Precise Positioning in GNSS-Challenged Environments[J]. Satellite Navigation, 2021, 2(1): 1-14.</w:t>
+        <w:t>[6] Wen W, Pfeifer T, Bai X W, et al. Factor graph optimization for GNSS/INS integration: A comparison with the extended Kalman filter[J]. NAVIGATION: Journal of the Institute of Navigation, 2021, 68(2): 315-331.</w:t>
       </w:r>
     </w:p>
     <w:p>
@@ -1954,7 +1903,7 @@
           <w:b w:val="0"/>
           <w:sz w:val="22"/>
         </w:rPr>
-        <w:t>[7] Dellaert F, Kaess M. Factor Graphs for Robot Perception[J]. Foundations and Trends in Robotics, 2017, 6(1-2): 1-139.</w:t>
+        <w:t>[7] Dellaert F, Kaess M. Factor graphs for robot perception[J]. Foundations and Trends in Robotics, 2017, 6(1-2): 1-139.</w:t>
       </w:r>
     </w:p>
     <w:p>
@@ -1968,7 +1917,7 @@
           <w:b w:val="0"/>
           <w:sz w:val="22"/>
         </w:rPr>
-        <w:t>[8] Indelman V, Williams S, Kaess M, et al. Information Fusion in Navigation Systems via Factor Graph Based Incremental Smoothing[J]. Robotics and Autonomous Systems, 2013, 61(8): 721-738.</w:t>
+        <w:t>[8] Indelman V, Williams S, Kaess M, et al. Information fusion in navigation systems via factor graph based incremental smoothing[J]. Robotics and Autonomous Systems, 2013, 61(8): 721-738.</w:t>
       </w:r>
     </w:p>
     <w:p>
@@ -1982,7 +1931,7 @@
           <w:b w:val="0"/>
           <w:sz w:val="22"/>
         </w:rPr>
-        <w:t>[9] Kaess M, Johannsson H, Roberts R, et al. iSAM2: Incremental Smoothing and Mapping Using the Bayes Tree[J]. International Journal of Robotics Research, 2012, 31(2): 216-235.</w:t>
+        <w:t>[9] Kaess M, Johannsson H, Roberts R, et al. iSAM2: Incremental smoothing and mapping using the Bayes tree[J]. International Journal of Robotics Research, 2012, 31(2): 216-235.</w:t>
       </w:r>
     </w:p>
     <w:p>
@@ -1996,7 +1945,7 @@
           <w:b w:val="0"/>
           <w:sz w:val="22"/>
         </w:rPr>
-        <w:t>[10] Wen W, Pfeifer T, Bai X W, et al. Factor Graph Optimization for GNSS/INS Integration: A Comparison with the Extended Kalman Filter[J]. NAVIGATION, 2021, 68(2): 315-331.</w:t>
+        <w:t>[10] Wen W, Zhang G, Hsu L T. GNSS outlier mitigation via graduated non-convexity factor graph optimization[J]. IEEE Transactions on Vehicular Technology, 2022, 71(1): 297-310.</w:t>
       </w:r>
     </w:p>
     <w:p>
@@ -2010,7 +1959,7 @@
           <w:b w:val="0"/>
           <w:sz w:val="22"/>
         </w:rPr>
-        <w:t>[11] Watson R M, Gross J N. Robust Navigation in GNSS Degraded Environment Using Graph Optimization[C]. Proceedings of the 30th International Technical Meeting of the Satellite Division of The Institute of Navigation (ION GNSS+ 2017), 2017: 2906-2918.</w:t>
+        <w:t>[11] Chi C, Zhan X Q, Wang S N, et al. GICI-LIB: A GNSS/INS/Camera integrated navigation library[J]. IEEE Robotics and Automation Letters, 2023, 8(12): 7970-7977.</w:t>
       </w:r>
     </w:p>
     <w:p>
@@ -2024,7 +1973,7 @@
           <w:b w:val="0"/>
           <w:sz w:val="22"/>
         </w:rPr>
-        <w:t>[12] Farrell J A. Aided Navigation: GPS with High Rate Sensors[M]. New York: McGraw-Hill, 2008.</w:t>
+        <w:t>[12] Jing H, Gao Y, Shahbeigi S, et al. Integrity monitoring of GNSS/INS based positioning solutions for autonomous vehicles[J]. Satellite Navigation, 2022, 3(1): 18.</w:t>
       </w:r>
     </w:p>
     <w:p>
@@ -2038,7 +1987,7 @@
           <w:b w:val="0"/>
           <w:sz w:val="22"/>
         </w:rPr>
-        <w:t>[13] Shin E H. Estimation Techniques for Low-Cost Inertial Navigation[D]. Calgary: University of Calgary, 2005.</w:t>
+        <w:t>[13] Bai X W, Wen W, Hsu L T. Using Sky-pointing fish-eye camera and LiDAR to aid GNSS single-point positioning in urban canyons[J]. IET Intelligent Transport Systems, 2021, 15(10): 1260-1273.</w:t>
       </w:r>
     </w:p>
     <w:p>
@@ -2052,7 +2001,7 @@
           <w:b w:val="0"/>
           <w:sz w:val="22"/>
         </w:rPr>
-        <w:t>[14] Hsu L T, Huang F J, Ng H F, et al. Hong Kong UrbanNav: An Open-source Multisensory Dataset for Benchmarking Urban Navigation Algorithms[J]. NAVIGATION, 2023, 70(4): navi.602.</w:t>
+        <w:t>[14] Zhang Q, Niu X J, Shi C. Assessment of the effect of GNSS sampling rate on GNSS/INS relative accuracy on different time scales for precision measurements[J]. Measurement, 2021, 170: 108686.</w:t>
       </w:r>
     </w:p>
     <w:p>
@@ -2066,7 +2015,7 @@
           <w:b w:val="0"/>
           <w:sz w:val="22"/>
         </w:rPr>
-        <w:t>[15] Chi C, Zhan X Q, Wang S N, et al. GICI-LIB: A GNSS/INS/Camera Integrated Navigation Library[J]. IEEE Robotics and Automation Letters, 2023, 8(12): 7970-7977.</w:t>
+        <w:t>[15] Cao S Z, Lu X Y, Shen S J. GVINS: Tightly coupled GNSS-visual-inertial fusion for smooth and consistent state estimation[J]. IEEE Transactions on Robotics, 2022, 38(4): 2004-2021.</w:t>
       </w:r>
     </w:p>
     <w:p>
@@ -2080,7 +2029,7 @@
           <w:b w:val="0"/>
           <w:sz w:val="22"/>
         </w:rPr>
-        <w:t>[16] Qin T, Li P L, Shen S J. VINS-Mono: A Robust and Versatile Monocular Visual-Inertial State Estimator[J]. IEEE Transactions on Robotics, 2018, 34(4): 1004-1020.</w:t>
+        <w:t>[16] Gao Z Z, Wang H B, Lv J J, et al. Tightly coupled integration of multi-GNSS PPP and MEMS inertial measurement unit data[J]. GPS Solutions, 2021, 25(4): 147.</w:t>
       </w:r>
     </w:p>
     <w:p>
@@ -2094,7 +2043,7 @@
           <w:b w:val="0"/>
           <w:sz w:val="22"/>
         </w:rPr>
-        <w:t>[17] Leutenegger S, Lynen S, Bosse M, et al. Keyframe-based Visual-inertial Odometry Using Nonlinear Optimization[J]. International Journal of Robotics Research, 2015, 34(3): 314-334.</w:t>
+        <w:t>[17] Zhang H, Xia X, Nitsch M, et al. Continuous-time factor graph optimization for trajectory smoothness of GNSS/INS navigation[J]. IEEE Robotics and Automation Letters, 2022, 7(4): 9543-9550.</w:t>
       </w:r>
     </w:p>
     <w:p>
@@ -2108,7 +2057,7 @@
           <w:b w:val="0"/>
           <w:sz w:val="22"/>
         </w:rPr>
-        <w:t>[18] Sage A P, Husa G W. Adaptive Filtering with Unknown Prior Statistics[C]. Proceedings of the Joint Automatic Control Conference, 1969: 760-769.</w:t>
+        <w:t>[18] Hsu L T, Huang F J, Ng H F, et al. Hong Kong UrbanNav: An open-source multisensory dataset for benchmarking urban navigation algorithms[J]. NAVIGATION: Journal of the Institute of Navigation, 2023, 70(4): navi.602.</w:t>
       </w:r>
     </w:p>
     <w:p>
@@ -2122,7 +2071,7 @@
           <w:b w:val="0"/>
           <w:sz w:val="22"/>
         </w:rPr>
-        <w:t>[19] 杨元喜. 自适应动态导航定位[M]. 北京: 测绘出版社, 2017.</w:t>
+        <w:t>[19] Qin T, Li P L, Shen S J. VINS-Mono: A robust and versatile monocular visual-inertial state estimator[J]. IEEE Transactions on Robotics, 2018, 34(4): 1004-1020.</w:t>
       </w:r>
     </w:p>
     <w:p>
@@ -2136,7 +2085,7 @@
           <w:b w:val="0"/>
           <w:sz w:val="22"/>
         </w:rPr>
-        <w:t>[20] Yang Y X, He H B, Xu G C. Adaptively Robust Filtering for Kinematic Geodetic Positioning[J]. Journal of Geodesy, 2001, 75(2): 109-116.</w:t>
+        <w:t>[20] Sünderhauf N, Protzel P. Switchable constraints for robust pose graph SLAM[C]. 2012 IEEE/RSJ International Conference on Intelligent Robots and Systems, 2012: 1879-1884.</w:t>
       </w:r>
     </w:p>
     <w:p>
@@ -2150,7 +2099,7 @@
           <w:b w:val="0"/>
           <w:sz w:val="22"/>
         </w:rPr>
-        <w:t>[21] Sünderhauf N, Protzel P. Switchable Constraints for Robust Pose Graph SLAM[C]. 2012 IEEE/RSJ International Conference on Intelligent Robots and Systems, 2012: 1879-1884.</w:t>
+        <w:t>[21] Pfeifer T, Protzel P. Robust sensor fusion with self-tuning mixture models[C]. 2018 IEEE/RSJ International Conference on Intelligent Robots and Systems, 2018: 3678-3685.</w:t>
       </w:r>
     </w:p>
     <w:p>
@@ -2164,7 +2113,7 @@
           <w:b w:val="0"/>
           <w:sz w:val="22"/>
         </w:rPr>
-        <w:t>[22] Pfeifer T, Protzel P. Expectation-Maximization for Adaptive Mixture Models in Graph Optimization[C]. 2019 IEEE International Conference on Robotics and Automation (ICRA), 2019: 3753-3759.</w:t>
+        <w:t>[22] 杨元喜. 自适应动态导航定位[M]. 2版. 北京: 测绘出版社, 2017.</w:t>
       </w:r>
     </w:p>
     <w:p>
@@ -2178,21 +2127,7 @@
           <w:b w:val="0"/>
           <w:sz w:val="22"/>
         </w:rPr>
-        <w:t>[23] Forster C, Carlone L, Dellaert F, et al. On-manifold Preintegration for Real-time Visual-Inertial Odometry[J]. IEEE Transactions on Robotics, 2017, 33(1): 1-21.</w:t>
-      </w:r>
-    </w:p>
-    <w:p>
-      <w:pPr>
-        <w:spacing w:line="360" w:lineRule="auto" w:after="60"/>
-        <w:ind w:left="480" w:hanging="480"/>
-      </w:pPr>
-      <w:r>
-        <w:rPr>
-          <w:rFonts w:ascii="Times New Roman" w:hAnsi="Times New Roman" w:eastAsia="SimSun"/>
-          <w:b w:val="0"/>
-          <w:sz w:val="22"/>
-        </w:rPr>
-        <w:t>[24] Hsu L T, Kubo N, Wen W, et al. UrbanNav: An Open-sourced Multisensory Dataset for Benchmarking Positioning Algorithms Designed for Urban Areas[C]. Proceedings of the 34th International Technical Meeting of the Satellite Division of The Institute of Navigation (ION GNSS+ 2021), 2021: 226-256.</w:t>
+        <w:t>[23] Zhang X H, Wang C Y, Guo Z Y, et al. Performance enhancement of tightly coupled GNSS/IMU integration based on factor graph with robust TDCP loop closure[J]. GPS Solutions, 2024, 28(2): 53.</w:t>
       </w:r>
     </w:p>
     <w:sectPr>

</xml_diff>